<commit_message>
Release v1.41 stabilize catalog initialization
</commit_message>
<xml_diff>
--- a/使用教学.docx
+++ b/使用教学.docx
@@ -28,7 +28,7 @@
           <w:color w:val="4E6C5C"/>
           <w:sz w:val="23"/>
         </w:rPr>
-        <w:t>适用于 v1.40 Windows 便携版</w:t>
+        <w:t>适用于 v1.41 Windows 便携版</w:t>
       </w:r>
     </w:p>
     <w:p>
@@ -233,7 +233,7 @@
                 <w:color w:val="000000"/>
                 <w:sz w:val="21"/>
               </w:rPr>
-              <w:t>完成登录后，单击左侧课程。程序会自动切到章节页签并读取目录，不必先在网页中手动打开章节。</w:t>
+              <w:t>完成登录后，单击左侧课程。程序会自动切到章节页签并读取目录。</w:t>
             </w:r>
           </w:p>
         </w:tc>
@@ -289,7 +289,7 @@
                 <w:color w:val="000000"/>
                 <w:sz w:val="21"/>
               </w:rPr>
-              <w:t>点顶部的“开始”。功能开启后会出现提示，右侧会显示当前视频和下一视频。</w:t>
+              <w:t>点顶部的“开始”。若目录尚未生成，程序会先打开首个真实章节完成加载，再继续查找。</w:t>
             </w:r>
           </w:p>
         </w:tc>
@@ -354,6 +354,69 @@
       <w:pPr>
         <w:spacing w:after="40"/>
       </w:pPr>
+    </w:p>
+    <w:p>
+      <w:pPr>
+        <w:pStyle w:val="Heading1"/>
+      </w:pPr>
+      <w:r>
+        <w:t>界面位置</w:t>
+      </w:r>
+    </w:p>
+    <w:p>
+      <w:pPr>
+        <w:keepNext/>
+        <w:jc w:val="center"/>
+      </w:pPr>
+      <w:r>
+        <w:drawing>
+          <wp:inline xmlns:a="http://schemas.openxmlformats.org/drawingml/2006/main" xmlns:pic="http://schemas.openxmlformats.org/drawingml/2006/picture">
+            <wp:extent cx="6400800" cy="3696236"/>
+            <wp:docPr id="1" name="Picture 1"/>
+            <wp:cNvGraphicFramePr>
+              <a:graphicFrameLocks noChangeAspect="1"/>
+            </wp:cNvGraphicFramePr>
+            <a:graphic>
+              <a:graphicData uri="http://schemas.openxmlformats.org/drawingml/2006/picture">
+                <pic:pic>
+                  <pic:nvPicPr>
+                    <pic:cNvPr id="0" name="app-main.png"/>
+                    <pic:cNvPicPr/>
+                  </pic:nvPicPr>
+                  <pic:blipFill>
+                    <a:blip r:embed="rId9"/>
+                    <a:stretch>
+                      <a:fillRect/>
+                    </a:stretch>
+                  </pic:blipFill>
+                  <pic:spPr>
+                    <a:xfrm>
+                      <a:off x="0" y="0"/>
+                      <a:ext cx="6400800" cy="3696236"/>
+                    </a:xfrm>
+                    <a:prstGeom prst="rect"/>
+                  </pic:spPr>
+                </pic:pic>
+              </a:graphicData>
+            </a:graphic>
+          </wp:inline>
+        </w:drawing>
+      </w:r>
+    </w:p>
+    <w:p>
+      <w:pPr>
+        <w:spacing w:after="200"/>
+        <w:jc w:val="center"/>
+      </w:pPr>
+      <w:r>
+        <w:rPr>
+          <w:rFonts w:ascii="Microsoft YaHei UI" w:hAnsi="Microsoft YaHei UI" w:eastAsia="Microsoft YaHei UI"/>
+          <w:b w:val="0"/>
+          <w:color w:val="4E6C5C"/>
+          <w:sz w:val="19"/>
+        </w:rPr>
+        <w:t>程序主界面：左侧选择课程与章节，中间显示学习通网页，右侧显示播放状态。</w:t>
+      </w:r>
     </w:p>
     <w:p>
       <w:r>
@@ -578,7 +641,7 @@
                 <w:color w:val="000000"/>
                 <w:sz w:val="21"/>
               </w:rPr>
-              <w:t>打开候选章节后再核对真实视频；若视频均已看完、只剩测验或作业，会继续寻找后面的未看完视频。</w:t>
+              <w:t>无需先手动点章节；程序会在需要时加载目录，连续核对状态后再打开真实待播目标。</w:t>
             </w:r>
           </w:p>
         </w:tc>
@@ -911,7 +974,7 @@
           <w:color w:val="000000"/>
           <w:sz w:val="22"/>
         </w:rPr>
-        <w:t>如果下一章节的视频需要进入后才加载，程序会等待目录补齐状态并自动重读；播放中会先显示待核验的下一章节，进入后再定位其中第一条真实未完成视频。</w:t>
+        <w:t>如果下一章节的视频需要进入后才加载，程序会先打开首个真实章节初始化目录，并在连续三次读到相同状态后再选目标；播放中会先显示待核验的下一章节，进入后再定位其中第一条真实未完成视频。</w:t>
       </w:r>
     </w:p>
     <w:p>
@@ -1116,7 +1179,7 @@
                 <w:color w:val="000000"/>
                 <w:sz w:val="21"/>
               </w:rPr>
-              <w:t>点“打开未完成章节”后留意按钮和顶部提示；目录状态出现较慢时请稍等，程序会自动重读，不必连续点击。</w:t>
+              <w:t>点“打开未完成章节”后留意按钮和顶部提示；尚未手动打开过章节也没关系，程序会自动初始化并连续核对目录。</w:t>
             </w:r>
           </w:p>
         </w:tc>

</xml_diff>

<commit_message>
Release v1.42 verify real next-video playback
</commit_message>
<xml_diff>
--- a/使用教学.docx
+++ b/使用教学.docx
@@ -28,7 +28,7 @@
           <w:color w:val="4E6C5C"/>
           <w:sz w:val="23"/>
         </w:rPr>
-        <w:t>适用于 v1.41 Windows 便携版</w:t>
+        <w:t>适用于 v1.42 Windows 便携版</w:t>
       </w:r>
     </w:p>
     <w:p>
@@ -233,7 +233,7 @@
                 <w:color w:val="000000"/>
                 <w:sz w:val="21"/>
               </w:rPr>
-              <w:t>完成登录后，单击左侧课程。程序会自动切到章节页签并读取目录。</w:t>
+              <w:t>完成登录并进入课程后，必须先在网页中手动点开任意一个视频。</w:t>
             </w:r>
           </w:p>
         </w:tc>
@@ -289,7 +289,7 @@
                 <w:color w:val="000000"/>
                 <w:sz w:val="21"/>
               </w:rPr>
-              <w:t>点顶部的“开始”。若目录尚未生成，程序会先打开首个真实章节完成加载，再继续查找。</w:t>
+              <w:t>视频页面出现后，再点“打开未完成章节”或顶部的“开始”。</w:t>
             </w:r>
           </w:p>
         </w:tc>
@@ -593,7 +593,7 @@
                 <w:color w:val="000000"/>
                 <w:sz w:val="21"/>
               </w:rPr>
-              <w:t>单击课程即可进入并切换到章节页签；目录出现较慢时程序会继续补读。</w:t>
+              <w:t>单击课程即可进入；进入后还需要先在网页中手动点开任意一个视频。</w:t>
             </w:r>
           </w:p>
         </w:tc>
@@ -641,7 +641,7 @@
                 <w:color w:val="000000"/>
                 <w:sz w:val="21"/>
               </w:rPr>
-              <w:t>无需先手动点章节；程序会在需要时加载目录，连续核对状态后再打开真实待播目标。</w:t>
+              <w:t>使用前必须先手动点开任意一个视频；页面加载完成后再查找真实待播目标。</w:t>
             </w:r>
           </w:p>
         </w:tc>
@@ -974,7 +974,7 @@
           <w:color w:val="000000"/>
           <w:sz w:val="22"/>
         </w:rPr>
-        <w:t>如果下一章节的视频需要进入后才加载，程序会先打开首个真实章节初始化目录，并在连续三次读到相同状态后再选目标；播放中会先显示待核验的下一章节，进入后再定位其中第一条真实未完成视频。</w:t>
+        <w:t>先手动点开任意一个视频后，程序会连续核对目录状态再选择目标；播放中会先显示待核验的下一章节，进入后再定位其中第一条真实未完成视频。</w:t>
       </w:r>
     </w:p>
     <w:p>
@@ -1124,7 +1124,7 @@
                 <w:color w:val="000000"/>
                 <w:sz w:val="21"/>
               </w:rPr>
-              <w:t>先点一次“开始”，再观察右侧的“当前视频”和“下一视频”。</w:t>
+              <w:t>进入课程后，必须先在网页中手动点开任意一个视频，并等待视频页面出现。</w:t>
             </w:r>
           </w:p>
         </w:tc>
@@ -1179,7 +1179,7 @@
                 <w:color w:val="000000"/>
                 <w:sz w:val="21"/>
               </w:rPr>
-              <w:t>点“打开未完成章节”后留意按钮和顶部提示；尚未手动打开过章节也没关系，程序会自动初始化并连续核对目录。</w:t>
+              <w:t>再点一次“开始”或“打开未完成章节”，观察右侧的“当前视频”和“下一视频”。</w:t>
             </w:r>
           </w:p>
         </w:tc>

</xml_diff>

<commit_message>
Release v1.43 harden continuous playback
</commit_message>
<xml_diff>
--- a/使用教学.docx
+++ b/使用教学.docx
@@ -28,7 +28,7 @@
           <w:color w:val="4E6C5C"/>
           <w:sz w:val="23"/>
         </w:rPr>
-        <w:t>适用于 v1.42 Windows 便携版</w:t>
+        <w:t>适用于 v1.43 Windows 便携版</w:t>
       </w:r>
     </w:p>
     <w:p>
@@ -993,6 +993,20 @@
     </w:p>
     <w:p>
       <w:pPr>
+        <w:spacing w:after="140" w:line="324" w:lineRule="auto"/>
+      </w:pPr>
+      <w:r>
+        <w:rPr>
+          <w:rFonts w:ascii="Microsoft YaHei UI" w:hAnsi="Microsoft YaHei UI" w:eastAsia="Microsoft YaHei UI"/>
+          <w:b w:val="0"/>
+          <w:color w:val="000000"/>
+          <w:sz w:val="22"/>
+        </w:rPr>
+        <w:t>如果程序知道本章还有下一段视频，但学习通没有真正切换成功，程序会停在当前章并给出提示，不会越过该视频或把本章当成已经检查完成。</w:t>
+      </w:r>
+    </w:p>
+    <w:p>
+      <w:pPr>
         <w:pStyle w:val="Heading1"/>
       </w:pPr>
       <w:r>
@@ -1346,7 +1360,7 @@
                 <w:color w:val="000000"/>
                 <w:sz w:val="21"/>
               </w:rPr>
-              <w:t>公开发送反馈包前，检查并删除课程名称、学校名称、页面地址参数等不便公开的信息。</w:t>
+              <w:t>v1.43 会自动遮盖常见令牌、签名和 Cookie；公开发送前仍请检查并删除不便公开的课程名称、学校名称等内容。</w:t>
             </w:r>
           </w:p>
         </w:tc>

</xml_diff>

<commit_message>
Release v1.44 use manually selected start video
</commit_message>
<xml_diff>
--- a/使用教学.docx
+++ b/使用教学.docx
@@ -28,7 +28,7 @@
           <w:color w:val="4E6C5C"/>
           <w:sz w:val="23"/>
         </w:rPr>
-        <w:t>适用于 v1.43 Windows 便携版</w:t>
+        <w:t>适用于 v1.44 Windows 便携版</w:t>
       </w:r>
     </w:p>
     <w:p>
@@ -42,7 +42,7 @@
           <w:color w:val="000000"/>
           <w:sz w:val="22"/>
         </w:rPr>
-        <w:t>这份教学面向第一次使用的同学。程序帮助减少重复点击：识别课程中的真实视频，按同一章节内的视频顺序继续播放，再查找后续未完成视频。课程是否完成仍以学习通页面的实际记录为准。</w:t>
+        <w:t>这份教学面向第一次使用的同学。先在学习通网页中自行选择准备观看的视频，程序会从该视频开始，按课程中的真实视频顺序继续播放。课程是否完成仍以学习通页面的实际记录为准。</w:t>
       </w:r>
     </w:p>
     <w:p>
@@ -233,7 +233,7 @@
                 <w:color w:val="000000"/>
                 <w:sz w:val="21"/>
               </w:rPr>
-              <w:t>完成登录并进入课程后，必须先在网页中手动点开任意一个视频。</w:t>
+              <w:t>完成登录并进入课程后，在网页中手动点开准备观看的视频。</w:t>
             </w:r>
           </w:p>
         </w:tc>
@@ -289,7 +289,7 @@
                 <w:color w:val="000000"/>
                 <w:sz w:val="21"/>
               </w:rPr>
-              <w:t>视频页面出现后，再点“打开未完成章节”或顶部的“开始”。</w:t>
+              <w:t>视频页面出现后，再点顶部的“开始”。</w:t>
             </w:r>
           </w:p>
         </w:tc>
@@ -543,7 +543,7 @@
                 <w:color w:val="000000"/>
                 <w:sz w:val="21"/>
               </w:rPr>
-              <w:t>识别当前课程和待播放视频，并尝试开始播放。</w:t>
+              <w:t>接管当前手动打开的视频，并尝试开始播放。</w:t>
             </w:r>
           </w:p>
         </w:tc>
@@ -618,7 +618,7 @@
                 <w:color w:val="000000"/>
                 <w:sz w:val="21"/>
               </w:rPr>
-              <w:t>打开未完成章节</w:t>
+              <w:t>暂停辅助</w:t>
             </w:r>
           </w:p>
         </w:tc>
@@ -641,7 +641,7 @@
                 <w:color w:val="000000"/>
                 <w:sz w:val="21"/>
               </w:rPr>
-              <w:t>使用前必须先手动点开任意一个视频；页面加载完成后再查找真实待播目标。</w:t>
+              <w:t>保留当前页面，但暂时不再自动查找或切换下一视频。</w:t>
             </w:r>
           </w:p>
         </w:tc>
@@ -667,7 +667,7 @@
                 <w:color w:val="000000"/>
                 <w:sz w:val="21"/>
               </w:rPr>
-              <w:t>暂停辅助</w:t>
+              <w:t>全屏观看</w:t>
             </w:r>
           </w:p>
         </w:tc>
@@ -675,54 +675,6 @@
           <w:tcPr>
             <w:tcW w:type="dxa" w:w="7992"/>
             <w:shd w:fill="E8F5EC"/>
-            <w:tcMar>
-              <w:top w:w="120" w:type="dxa"/>
-              <w:start w:w="140" w:type="dxa"/>
-              <w:bottom w:w="120" w:type="dxa"/>
-              <w:end w:w="140" w:type="dxa"/>
-            </w:tcMar>
-            <w:vAlign w:val="center"/>
-          </w:tcPr>
-          <w:p>
-            <w:r>
-              <w:rPr>
-                <w:rFonts w:ascii="Microsoft YaHei UI" w:hAnsi="Microsoft YaHei UI" w:eastAsia="Microsoft YaHei UI"/>
-                <w:b w:val="0"/>
-                <w:color w:val="000000"/>
-                <w:sz w:val="21"/>
-              </w:rPr>
-              <w:t>保留当前页面，但暂时不再自动查找或切换下一视频。</w:t>
-            </w:r>
-          </w:p>
-        </w:tc>
-      </w:tr>
-      <w:tr>
-        <w:tc>
-          <w:tcPr>
-            <w:tcW w:type="dxa" w:w="1800"/>
-            <w:tcMar>
-              <w:top w:w="120" w:type="dxa"/>
-              <w:start w:w="140" w:type="dxa"/>
-              <w:bottom w:w="120" w:type="dxa"/>
-              <w:end w:w="140" w:type="dxa"/>
-            </w:tcMar>
-            <w:vAlign w:val="center"/>
-          </w:tcPr>
-          <w:p>
-            <w:r>
-              <w:rPr>
-                <w:rFonts w:ascii="Microsoft YaHei UI" w:hAnsi="Microsoft YaHei UI" w:eastAsia="Microsoft YaHei UI"/>
-                <w:b/>
-                <w:color w:val="000000"/>
-                <w:sz w:val="21"/>
-              </w:rPr>
-              <w:t>全屏观看</w:t>
-            </w:r>
-          </w:p>
-        </w:tc>
-        <w:tc>
-          <w:tcPr>
-            <w:tcW w:type="dxa" w:w="7992"/>
             <w:tcMar>
               <w:top w:w="120" w:type="dxa"/>
               <w:start w:w="140" w:type="dxa"/>
@@ -748,7 +700,6 @@
         <w:tc>
           <w:tcPr>
             <w:tcW w:type="dxa" w:w="1800"/>
-            <w:shd w:fill="E8F5EC"/>
             <w:tcMar>
               <w:top w:w="120" w:type="dxa"/>
               <w:start w:w="140" w:type="dxa"/>
@@ -772,7 +723,6 @@
         <w:tc>
           <w:tcPr>
             <w:tcW w:type="dxa" w:w="7992"/>
-            <w:shd w:fill="E8F5EC"/>
             <w:tcMar>
               <w:top w:w="120" w:type="dxa"/>
               <w:start w:w="140" w:type="dxa"/>
@@ -798,6 +748,7 @@
         <w:tc>
           <w:tcPr>
             <w:tcW w:type="dxa" w:w="1800"/>
+            <w:shd w:fill="E8F5EC"/>
             <w:tcMar>
               <w:top w:w="120" w:type="dxa"/>
               <w:start w:w="140" w:type="dxa"/>
@@ -821,6 +772,7 @@
         <w:tc>
           <w:tcPr>
             <w:tcW w:type="dxa" w:w="7992"/>
+            <w:shd w:fill="E8F5EC"/>
             <w:tcMar>
               <w:top w:w="120" w:type="dxa"/>
               <w:start w:w="140" w:type="dxa"/>
@@ -846,7 +798,6 @@
         <w:tc>
           <w:tcPr>
             <w:tcW w:type="dxa" w:w="1800"/>
-            <w:shd w:fill="E8F5EC"/>
             <w:tcMar>
               <w:top w:w="120" w:type="dxa"/>
               <w:start w:w="140" w:type="dxa"/>
@@ -870,7 +821,6 @@
         <w:tc>
           <w:tcPr>
             <w:tcW w:type="dxa" w:w="7992"/>
-            <w:shd w:fill="E8F5EC"/>
             <w:tcMar>
               <w:top w:w="120" w:type="dxa"/>
               <w:start w:w="140" w:type="dxa"/>
@@ -896,6 +846,7 @@
         <w:tc>
           <w:tcPr>
             <w:tcW w:type="dxa" w:w="1800"/>
+            <w:shd w:fill="E8F5EC"/>
             <w:tcMar>
               <w:top w:w="120" w:type="dxa"/>
               <w:start w:w="140" w:type="dxa"/>
@@ -919,6 +870,7 @@
         <w:tc>
           <w:tcPr>
             <w:tcW w:type="dxa" w:w="7992"/>
+            <w:shd w:fill="E8F5EC"/>
             <w:tcMar>
               <w:top w:w="120" w:type="dxa"/>
               <w:start w:w="140" w:type="dxa"/>
@@ -974,7 +926,7 @@
           <w:color w:val="000000"/>
           <w:sz w:val="22"/>
         </w:rPr>
-        <w:t>先手动点开任意一个视频后，程序会连续核对目录状态再选择目标；播放中会先显示待核验的下一章节，进入后再定位其中第一条真实未完成视频。</w:t>
+        <w:t>先手动点开准备观看的视频后，程序会从该位置继续；播放中会先显示待核验的下一章节，进入后再定位其中第一条真实视频。</w:t>
       </w:r>
     </w:p>
     <w:p>
@@ -988,7 +940,7 @@
           <w:color w:val="000000"/>
           <w:sz w:val="22"/>
         </w:rPr>
-        <w:t>章节即使显示未完成，只要其中视频都已看完，也会继续向后寻找，不会停在只剩测验或作业的章节。按钮查找和自然结束后的顺序跳转遵守相同规则。</w:t>
+        <w:t>章节即使显示未完成，只要其中视频都已看完，也会继续向后寻找，不会停在只剩测验或作业的章节。</w:t>
       </w:r>
     </w:p>
     <w:p>
@@ -1193,7 +1145,7 @@
                 <w:color w:val="000000"/>
                 <w:sz w:val="21"/>
               </w:rPr>
-              <w:t>再点一次“开始”或“打开未完成章节”，观察右侧的“当前视频”和“下一视频”。</w:t>
+              <w:t>再点一次“开始”，观察右侧的“当前视频”和“下一视频”。</w:t>
             </w:r>
           </w:p>
         </w:tc>
@@ -1360,7 +1312,7 @@
                 <w:color w:val="000000"/>
                 <w:sz w:val="21"/>
               </w:rPr>
-              <w:t>v1.43 会自动遮盖常见令牌、签名和 Cookie；公开发送前仍请检查并删除不便公开的课程名称、学校名称等内容。</w:t>
+              <w:t>v1.44 会自动遮盖常见令牌、签名和 Cookie；公开发送前仍请检查并删除不便公开的课程名称、学校名称等内容。</w:t>
             </w:r>
           </w:p>
         </w:tc>

</xml_diff>

<commit_message>
Release v1.45 stabilize slow player loading
</commit_message>
<xml_diff>
--- a/使用教学.docx
+++ b/使用教学.docx
@@ -28,7 +28,7 @@
           <w:color w:val="4E6C5C"/>
           <w:sz w:val="23"/>
         </w:rPr>
-        <w:t>适用于 v1.44 Windows 便携版</w:t>
+        <w:t>适用于 v1.45 Windows 便携版</w:t>
       </w:r>
     </w:p>
     <w:p>
@@ -940,6 +940,20 @@
           <w:color w:val="000000"/>
           <w:sz w:val="22"/>
         </w:rPr>
+        <w:t>学习通切换下一视频通常需要约半分钟。显示“下一视频加载中”时请保持页面开启，不要反复点击；视频时间开始增长后，程序才会确认播放成功。约 40 秒仍未播放时会停在当前目标并提示。</w:t>
+      </w:r>
+    </w:p>
+    <w:p>
+      <w:pPr>
+        <w:spacing w:after="140" w:line="324" w:lineRule="auto"/>
+      </w:pPr>
+      <w:r>
+        <w:rPr>
+          <w:rFonts w:ascii="Microsoft YaHei UI" w:hAnsi="Microsoft YaHei UI" w:eastAsia="Microsoft YaHei UI"/>
+          <w:b w:val="0"/>
+          <w:color w:val="000000"/>
+          <w:sz w:val="22"/>
+        </w:rPr>
         <w:t>章节即使显示未完成，只要其中视频都已看完，也会继续向后寻找，不会停在只剩测验或作业的章节。</w:t>
       </w:r>
     </w:p>
@@ -1312,7 +1326,7 @@
                 <w:color w:val="000000"/>
                 <w:sz w:val="21"/>
               </w:rPr>
-              <w:t>v1.44 会自动遮盖常见令牌、签名和 Cookie；公开发送前仍请检查并删除不便公开的课程名称、学校名称等内容。</w:t>
+              <w:t>v1.45 会自动遮盖常见令牌、签名和 Cookie；公开发送前仍请检查并删除不便公开的课程名称、学校名称等内容。</w:t>
             </w:r>
           </w:p>
         </w:tc>

</xml_diff>

<commit_message>
Release v1.46: 90-second waits, lazy player targeting and one-click mute
</commit_message>
<xml_diff>
--- a/使用教学.docx
+++ b/使用教学.docx
@@ -28,7 +28,7 @@
           <w:color w:val="4E6C5C"/>
           <w:sz w:val="23"/>
         </w:rPr>
-        <w:t>适用于 v1.45 Windows 便携版</w:t>
+        <w:t>适用于 v1.46 Windows 便携版</w:t>
       </w:r>
     </w:p>
     <w:p>
@@ -569,6 +569,55 @@
                 <w:color w:val="000000"/>
                 <w:sz w:val="21"/>
               </w:rPr>
+              <w:t>静音 / 已静音</w:t>
+            </w:r>
+          </w:p>
+        </w:tc>
+        <w:tc>
+          <w:tcPr>
+            <w:tcW w:type="dxa" w:w="7992"/>
+            <w:shd w:fill="E8F5EC"/>
+            <w:tcMar>
+              <w:top w:w="120" w:type="dxa"/>
+              <w:start w:w="140" w:type="dxa"/>
+              <w:bottom w:w="120" w:type="dxa"/>
+              <w:end w:w="140" w:type="dxa"/>
+            </w:tcMar>
+            <w:vAlign w:val="center"/>
+          </w:tcPr>
+          <w:p>
+            <w:r>
+              <w:rPr>
+                <w:rFonts w:ascii="Microsoft YaHei UI" w:hAnsi="Microsoft YaHei UI" w:eastAsia="Microsoft YaHei UI"/>
+                <w:b w:val="0"/>
+                <w:color w:val="000000"/>
+                <w:sz w:val="21"/>
+              </w:rPr>
+              <w:t>点击静音后视频继续播放；切换视频仍保持静音。再次点击“已静音”恢复声音，不影响其他软件。</w:t>
+            </w:r>
+          </w:p>
+        </w:tc>
+      </w:tr>
+      <w:tr>
+        <w:tc>
+          <w:tcPr>
+            <w:tcW w:type="dxa" w:w="1800"/>
+            <w:tcMar>
+              <w:top w:w="120" w:type="dxa"/>
+              <w:start w:w="140" w:type="dxa"/>
+              <w:bottom w:w="120" w:type="dxa"/>
+              <w:end w:w="140" w:type="dxa"/>
+            </w:tcMar>
+            <w:vAlign w:val="center"/>
+          </w:tcPr>
+          <w:p>
+            <w:r>
+              <w:rPr>
+                <w:rFonts w:ascii="Microsoft YaHei UI" w:hAnsi="Microsoft YaHei UI" w:eastAsia="Microsoft YaHei UI"/>
+                <w:b/>
+                <w:color w:val="000000"/>
+                <w:sz w:val="21"/>
+              </w:rPr>
               <w:t>课程列表</w:t>
             </w:r>
           </w:p>
@@ -576,7 +625,6 @@
         <w:tc>
           <w:tcPr>
             <w:tcW w:type="dxa" w:w="7992"/>
-            <w:shd w:fill="E8F5EC"/>
             <w:tcMar>
               <w:top w:w="120" w:type="dxa"/>
               <w:start w:w="140" w:type="dxa"/>
@@ -602,6 +650,7 @@
         <w:tc>
           <w:tcPr>
             <w:tcW w:type="dxa" w:w="1800"/>
+            <w:shd w:fill="E8F5EC"/>
             <w:tcMar>
               <w:top w:w="120" w:type="dxa"/>
               <w:start w:w="140" w:type="dxa"/>
@@ -625,6 +674,7 @@
         <w:tc>
           <w:tcPr>
             <w:tcW w:type="dxa" w:w="7992"/>
+            <w:shd w:fill="E8F5EC"/>
             <w:tcMar>
               <w:top w:w="120" w:type="dxa"/>
               <w:start w:w="140" w:type="dxa"/>
@@ -650,7 +700,6 @@
         <w:tc>
           <w:tcPr>
             <w:tcW w:type="dxa" w:w="1800"/>
-            <w:shd w:fill="E8F5EC"/>
             <w:tcMar>
               <w:top w:w="120" w:type="dxa"/>
               <w:start w:w="140" w:type="dxa"/>
@@ -674,7 +723,6 @@
         <w:tc>
           <w:tcPr>
             <w:tcW w:type="dxa" w:w="7992"/>
-            <w:shd w:fill="E8F5EC"/>
             <w:tcMar>
               <w:top w:w="120" w:type="dxa"/>
               <w:start w:w="140" w:type="dxa"/>
@@ -700,6 +748,7 @@
         <w:tc>
           <w:tcPr>
             <w:tcW w:type="dxa" w:w="1800"/>
+            <w:shd w:fill="E8F5EC"/>
             <w:tcMar>
               <w:top w:w="120" w:type="dxa"/>
               <w:start w:w="140" w:type="dxa"/>
@@ -723,6 +772,7 @@
         <w:tc>
           <w:tcPr>
             <w:tcW w:type="dxa" w:w="7992"/>
+            <w:shd w:fill="E8F5EC"/>
             <w:tcMar>
               <w:top w:w="120" w:type="dxa"/>
               <w:start w:w="140" w:type="dxa"/>
@@ -748,7 +798,6 @@
         <w:tc>
           <w:tcPr>
             <w:tcW w:type="dxa" w:w="1800"/>
-            <w:shd w:fill="E8F5EC"/>
             <w:tcMar>
               <w:top w:w="120" w:type="dxa"/>
               <w:start w:w="140" w:type="dxa"/>
@@ -772,7 +821,6 @@
         <w:tc>
           <w:tcPr>
             <w:tcW w:type="dxa" w:w="7992"/>
-            <w:shd w:fill="E8F5EC"/>
             <w:tcMar>
               <w:top w:w="120" w:type="dxa"/>
               <w:start w:w="140" w:type="dxa"/>
@@ -798,6 +846,7 @@
         <w:tc>
           <w:tcPr>
             <w:tcW w:type="dxa" w:w="1800"/>
+            <w:shd w:fill="E8F5EC"/>
             <w:tcMar>
               <w:top w:w="120" w:type="dxa"/>
               <w:start w:w="140" w:type="dxa"/>
@@ -821,6 +870,7 @@
         <w:tc>
           <w:tcPr>
             <w:tcW w:type="dxa" w:w="7992"/>
+            <w:shd w:fill="E8F5EC"/>
             <w:tcMar>
               <w:top w:w="120" w:type="dxa"/>
               <w:start w:w="140" w:type="dxa"/>
@@ -846,7 +896,6 @@
         <w:tc>
           <w:tcPr>
             <w:tcW w:type="dxa" w:w="1800"/>
-            <w:shd w:fill="E8F5EC"/>
             <w:tcMar>
               <w:top w:w="120" w:type="dxa"/>
               <w:start w:w="140" w:type="dxa"/>
@@ -870,7 +919,6 @@
         <w:tc>
           <w:tcPr>
             <w:tcW w:type="dxa" w:w="7992"/>
-            <w:shd w:fill="E8F5EC"/>
             <w:tcMar>
               <w:top w:w="120" w:type="dxa"/>
               <w:start w:w="140" w:type="dxa"/>
@@ -940,7 +988,7 @@
           <w:color w:val="000000"/>
           <w:sz w:val="22"/>
         </w:rPr>
-        <w:t>学习通切换下一视频通常需要约半分钟。显示“下一视频加载中”时请保持页面开启，不要反复点击；视频时间开始增长后，程序才会确认播放成功。约 40 秒仍未播放时会停在当前目标并提示。</w:t>
+        <w:t>学习通切换下一视频通常需要约半分钟。显示“下一视频加载中”时请保持页面开启，不要反复点击；视频时间开始增长后，程序才会确认播放成功。各加载或播放确认阶段最多等待 90 秒，成功后立即继续；超时仍未成功会停在当前目标并提示。</w:t>
       </w:r>
     </w:p>
     <w:p>
@@ -1326,7 +1374,7 @@
                 <w:color w:val="000000"/>
                 <w:sz w:val="21"/>
               </w:rPr>
-              <w:t>v1.45 会自动遮盖常见令牌、签名和 Cookie；公开发送前仍请检查并删除不便公开的课程名称、学校名称等内容。</w:t>
+              <w:t>v1.46 会自动遮盖常见令牌、签名和 Cookie；公开发送前仍请检查并删除不便公开的课程名称、学校名称等内容。</w:t>
             </w:r>
           </w:p>
         </w:tc>
@@ -1336,6 +1384,11 @@
       <w:pPr>
         <w:spacing w:after="40"/>
       </w:pPr>
+    </w:p>
+    <w:p>
+      <w:r>
+        <w:br w:type="page"/>
+      </w:r>
     </w:p>
     <w:p>
       <w:pPr>

</xml_diff>